<commit_message>
remove em and en dashes across all lab 4 files and submissions
</commit_message>
<xml_diff>
--- a/submissions/Muhammad_Tayyab_023-24-0118_Week_04_Lab_Submission.docx
+++ b/submissions/Muhammad_Tayyab_023-24-0118_Week_04_Lab_Submission.docx
@@ -266,7 +266,7 @@
                 <w:color w:val="334155"/>
                 <w:sz w:val="19"/>
               </w:rPr>
-              <w:t>5th Semester — Fall 2026</w:t>
+              <w:t>5th Semester, Fall 2026</w:t>
             </w:r>
           </w:p>
         </w:tc>
@@ -441,7 +441,7 @@
           <w:color w:val="282828"/>
           <w:sz w:val="19"/>
         </w:rPr>
-        <w:t>In Flexbox (display: flex), all 7 boxes (A–G) remained in a single horizontal row, shrinking in width to fit. In CSS Grid (grid-template-columns: 1fr 1fr 1fr), box G automatically wrapped and started a new 3rd row right under box A.</w:t>
+        <w:t>In Flexbox (display: flex), all 7 boxes (A to G) remained in a single horizontal row, shrinking in width to fit. In CSS Grid (grid-template-columns: 1fr 1fr 1fr), box G automatically wrapped and started a new 3rd row right under box A.</w:t>
       </w:r>
     </w:p>
     <w:p>
@@ -1988,7 +1988,7 @@
         <w:color w:val="787878"/>
         <w:sz w:val="16"/>
       </w:rPr>
-      <w:t>Department of Computer Science — 5th Semester</w:t>
+      <w:t>Department of Computer Science (5th Semester)</w:t>
       <w:tab/>
       <w:tab/>
       <w:t>Lab 04 Submission</w:t>
@@ -2009,7 +2009,7 @@
         <w:color w:val="646464"/>
         <w:sz w:val="16"/>
       </w:rPr>
-      <w:t>Web Engineering Lab Report — Muhammad Tayyab (023-24-0118)</w:t>
+      <w:t>Web Engineering Lab Report - Muhammad Tayyab (023-24-0118)</w:t>
     </w:r>
   </w:p>
 </w:hdr>

</xml_diff>

<commit_message>
update lab 4 submission with clean student report format
</commit_message>
<xml_diff>
--- a/submissions/Muhammad_Tayyab_023-24-0118_Week_04_Lab_Submission.docx
+++ b/submissions/Muhammad_Tayyab_023-24-0118_Week_04_Lab_Submission.docx
@@ -4,29 +4,28 @@
   <w:body>
     <w:p>
       <w:pPr>
-        <w:spacing w:before="600" w:after="40"/>
+        <w:spacing w:before="800" w:after="40"/>
         <w:jc w:val="center"/>
       </w:pPr>
       <w:r>
         <w:rPr>
           <w:b/>
-          <w:color w:val="1A237E"/>
-          <w:sz w:val="24"/>
+          <w:sz w:val="28"/>
         </w:rPr>
-        <w:t>DEPARTMENT OF COMPUTER SCIENCE</w:t>
+        <w:t>SUKKUR IBA UNIVERSITY</w:t>
       </w:r>
     </w:p>
     <w:p>
       <w:pPr>
-        <w:spacing w:before="0" w:after="480"/>
+        <w:spacing w:before="0" w:after="600"/>
         <w:jc w:val="center"/>
       </w:pPr>
       <w:r>
         <w:rPr>
-          <w:color w:val="646464"/>
-          <w:sz w:val="20"/>
+          <w:color w:val="505050"/>
+          <w:sz w:val="22"/>
         </w:rPr>
-        <w:t>Web Engineering (5th Semester)</w:t>
+        <w:t>Department of Computer Science</w:t>
       </w:r>
     </w:p>
     <w:p>
@@ -37,23 +36,22 @@
       <w:r>
         <w:rPr>
           <w:b/>
-          <w:color w:val="0F172A"/>
-          <w:sz w:val="44"/>
+          <w:sz w:val="40"/>
         </w:rPr>
-        <w:t>LAB 04 SUBMISSION</w:t>
+        <w:t>Lab Report 04: CSS Layout</w:t>
       </w:r>
     </w:p>
     <w:p>
       <w:pPr>
-        <w:spacing w:before="0" w:after="480"/>
+        <w:spacing w:before="0" w:after="600"/>
         <w:jc w:val="center"/>
       </w:pPr>
       <w:r>
         <w:rPr>
-          <w:color w:val="334155"/>
-          <w:sz w:val="24"/>
+          <w:color w:val="505050"/>
+          <w:sz w:val="22"/>
         </w:rPr>
-        <w:t>CSS Layout: Flexbox, CSS Grid, Mobile-First Breakpoints &amp; Positioning</w:t>
+        <w:t>Flexbox, CSS Grid, Mobile-First Media Queries &amp; Positioning</w:t>
       </w:r>
     </w:p>
     <w:tbl>
@@ -70,11 +68,11 @@
       <w:tr>
         <w:tc>
           <w:tcPr>
-            <w:tcW w:type="dxa" w:w="3168"/>
-            <w:shd w:fill="F8FAFC"/>
+            <w:tcW w:type="dxa" w:w="2880"/>
+            <w:shd w:fill="F8F8F8"/>
             <w:tcMar>
-              <w:top w:w="70" w:type="dxa"/>
-              <w:bottom w:w="70" w:type="dxa"/>
+              <w:top w:w="60" w:type="dxa"/>
+              <w:bottom w:w="60" w:type="dxa"/>
               <w:left w:w="100" w:type="dxa"/>
               <w:right w:w="100" w:type="dxa"/>
             </w:tcMar>
@@ -86,7 +84,6 @@
             <w:r>
               <w:rPr>
                 <w:b/>
-                <w:color w:val="1E293B"/>
                 <w:sz w:val="19"/>
               </w:rPr>
               <w:t>Student Name:</w:t>
@@ -95,11 +92,11 @@
         </w:tc>
         <w:tc>
           <w:tcPr>
-            <w:tcW w:type="dxa" w:w="6192"/>
-            <w:shd w:fill="F8FAFC"/>
+            <w:tcW w:type="dxa" w:w="6480"/>
+            <w:shd w:fill="F8F8F8"/>
             <w:tcMar>
-              <w:top w:w="70" w:type="dxa"/>
-              <w:bottom w:w="70" w:type="dxa"/>
+              <w:top w:w="60" w:type="dxa"/>
+              <w:bottom w:w="60" w:type="dxa"/>
               <w:left w:w="100" w:type="dxa"/>
               <w:right w:w="100" w:type="dxa"/>
             </w:tcMar>
@@ -110,7 +107,6 @@
             </w:pPr>
             <w:r>
               <w:rPr>
-                <w:color w:val="334155"/>
                 <w:sz w:val="19"/>
               </w:rPr>
               <w:t>Muhammad Tayyab</w:t>
@@ -121,11 +117,11 @@
       <w:tr>
         <w:tc>
           <w:tcPr>
-            <w:tcW w:type="dxa" w:w="3168"/>
-            <w:shd w:fill="F8FAFC"/>
+            <w:tcW w:type="dxa" w:w="2880"/>
+            <w:shd w:fill="F8F8F8"/>
             <w:tcMar>
-              <w:top w:w="70" w:type="dxa"/>
-              <w:bottom w:w="70" w:type="dxa"/>
+              <w:top w:w="60" w:type="dxa"/>
+              <w:bottom w:w="60" w:type="dxa"/>
               <w:left w:w="100" w:type="dxa"/>
               <w:right w:w="100" w:type="dxa"/>
             </w:tcMar>
@@ -137,7 +133,6 @@
             <w:r>
               <w:rPr>
                 <w:b/>
-                <w:color w:val="1E293B"/>
                 <w:sz w:val="19"/>
               </w:rPr>
               <w:t>CMS ID:</w:t>
@@ -146,11 +141,11 @@
         </w:tc>
         <w:tc>
           <w:tcPr>
-            <w:tcW w:type="dxa" w:w="6192"/>
-            <w:shd w:fill="F8FAFC"/>
+            <w:tcW w:type="dxa" w:w="6480"/>
+            <w:shd w:fill="F8F8F8"/>
             <w:tcMar>
-              <w:top w:w="70" w:type="dxa"/>
-              <w:bottom w:w="70" w:type="dxa"/>
+              <w:top w:w="60" w:type="dxa"/>
+              <w:bottom w:w="60" w:type="dxa"/>
               <w:left w:w="100" w:type="dxa"/>
               <w:right w:w="100" w:type="dxa"/>
             </w:tcMar>
@@ -161,7 +156,6 @@
             </w:pPr>
             <w:r>
               <w:rPr>
-                <w:color w:val="334155"/>
                 <w:sz w:val="19"/>
               </w:rPr>
               <w:t>023-24-0118</w:t>
@@ -172,11 +166,11 @@
       <w:tr>
         <w:tc>
           <w:tcPr>
-            <w:tcW w:type="dxa" w:w="3168"/>
-            <w:shd w:fill="F8FAFC"/>
+            <w:tcW w:type="dxa" w:w="2880"/>
+            <w:shd w:fill="F8F8F8"/>
             <w:tcMar>
-              <w:top w:w="70" w:type="dxa"/>
-              <w:bottom w:w="70" w:type="dxa"/>
+              <w:top w:w="60" w:type="dxa"/>
+              <w:bottom w:w="60" w:type="dxa"/>
               <w:left w:w="100" w:type="dxa"/>
               <w:right w:w="100" w:type="dxa"/>
             </w:tcMar>
@@ -188,7 +182,6 @@
             <w:r>
               <w:rPr>
                 <w:b/>
-                <w:color w:val="1E293B"/>
                 <w:sz w:val="19"/>
               </w:rPr>
               <w:t>Course:</w:t>
@@ -197,11 +190,11 @@
         </w:tc>
         <w:tc>
           <w:tcPr>
-            <w:tcW w:type="dxa" w:w="6192"/>
-            <w:shd w:fill="F8FAFC"/>
+            <w:tcW w:type="dxa" w:w="6480"/>
+            <w:shd w:fill="F8F8F8"/>
             <w:tcMar>
-              <w:top w:w="70" w:type="dxa"/>
-              <w:bottom w:w="70" w:type="dxa"/>
+              <w:top w:w="60" w:type="dxa"/>
+              <w:bottom w:w="60" w:type="dxa"/>
               <w:left w:w="100" w:type="dxa"/>
               <w:right w:w="100" w:type="dxa"/>
             </w:tcMar>
@@ -212,10 +205,9 @@
             </w:pPr>
             <w:r>
               <w:rPr>
-                <w:color w:val="334155"/>
                 <w:sz w:val="19"/>
               </w:rPr>
-              <w:t>Web Engineering</w:t>
+              <w:t>Web Engineering (CSE-311)</w:t>
             </w:r>
           </w:p>
         </w:tc>
@@ -223,11 +215,11 @@
       <w:tr>
         <w:tc>
           <w:tcPr>
-            <w:tcW w:type="dxa" w:w="3168"/>
-            <w:shd w:fill="F8FAFC"/>
+            <w:tcW w:type="dxa" w:w="2880"/>
+            <w:shd w:fill="F8F8F8"/>
             <w:tcMar>
-              <w:top w:w="70" w:type="dxa"/>
-              <w:bottom w:w="70" w:type="dxa"/>
+              <w:top w:w="60" w:type="dxa"/>
+              <w:bottom w:w="60" w:type="dxa"/>
               <w:left w:w="100" w:type="dxa"/>
               <w:right w:w="100" w:type="dxa"/>
             </w:tcMar>
@@ -239,7 +231,6 @@
             <w:r>
               <w:rPr>
                 <w:b/>
-                <w:color w:val="1E293B"/>
                 <w:sz w:val="19"/>
               </w:rPr>
               <w:t>Semester:</w:t>
@@ -248,11 +239,11 @@
         </w:tc>
         <w:tc>
           <w:tcPr>
-            <w:tcW w:type="dxa" w:w="6192"/>
-            <w:shd w:fill="F8FAFC"/>
+            <w:tcW w:type="dxa" w:w="6480"/>
+            <w:shd w:fill="F8F8F8"/>
             <w:tcMar>
-              <w:top w:w="70" w:type="dxa"/>
-              <w:bottom w:w="70" w:type="dxa"/>
+              <w:top w:w="60" w:type="dxa"/>
+              <w:bottom w:w="60" w:type="dxa"/>
               <w:left w:w="100" w:type="dxa"/>
               <w:right w:w="100" w:type="dxa"/>
             </w:tcMar>
@@ -263,10 +254,9 @@
             </w:pPr>
             <w:r>
               <w:rPr>
-                <w:color w:val="334155"/>
                 <w:sz w:val="19"/>
               </w:rPr>
-              <w:t>5th Semester, Fall 2026</w:t>
+              <w:t>5th Semester (Fall 2026)</w:t>
             </w:r>
           </w:p>
         </w:tc>
@@ -274,11 +264,11 @@
       <w:tr>
         <w:tc>
           <w:tcPr>
-            <w:tcW w:type="dxa" w:w="3168"/>
-            <w:shd w:fill="F8FAFC"/>
+            <w:tcW w:type="dxa" w:w="2880"/>
+            <w:shd w:fill="F8F8F8"/>
             <w:tcMar>
-              <w:top w:w="70" w:type="dxa"/>
-              <w:bottom w:w="70" w:type="dxa"/>
+              <w:top w:w="60" w:type="dxa"/>
+              <w:bottom w:w="60" w:type="dxa"/>
               <w:left w:w="100" w:type="dxa"/>
               <w:right w:w="100" w:type="dxa"/>
             </w:tcMar>
@@ -290,20 +280,19 @@
             <w:r>
               <w:rPr>
                 <w:b/>
-                <w:color w:val="1E293B"/>
                 <w:sz w:val="19"/>
               </w:rPr>
-              <w:t>Lab Deliverable:</w:t>
+              <w:t>Submitted To:</w:t>
             </w:r>
           </w:p>
         </w:tc>
         <w:tc>
           <w:tcPr>
-            <w:tcW w:type="dxa" w:w="6192"/>
-            <w:shd w:fill="F8FAFC"/>
+            <w:tcW w:type="dxa" w:w="6480"/>
+            <w:shd w:fill="F8F8F8"/>
             <w:tcMar>
-              <w:top w:w="70" w:type="dxa"/>
-              <w:bottom w:w="70" w:type="dxa"/>
+              <w:top w:w="60" w:type="dxa"/>
+              <w:bottom w:w="60" w:type="dxa"/>
               <w:left w:w="100" w:type="dxa"/>
               <w:right w:w="100" w:type="dxa"/>
             </w:tcMar>
@@ -314,10 +303,9 @@
             </w:pPr>
             <w:r>
               <w:rPr>
-                <w:color w:val="334155"/>
                 <w:sz w:val="19"/>
               </w:rPr>
-              <w:t>Week 04: CSS Layout (Flexbox &amp; Grid)</w:t>
+              <w:t>Lab Instructor</w:t>
             </w:r>
           </w:p>
         </w:tc>
@@ -325,11 +313,11 @@
       <w:tr>
         <w:tc>
           <w:tcPr>
-            <w:tcW w:type="dxa" w:w="3168"/>
-            <w:shd w:fill="F8FAFC"/>
+            <w:tcW w:type="dxa" w:w="2880"/>
+            <w:shd w:fill="F8F8F8"/>
             <w:tcMar>
-              <w:top w:w="70" w:type="dxa"/>
-              <w:bottom w:w="70" w:type="dxa"/>
+              <w:top w:w="60" w:type="dxa"/>
+              <w:bottom w:w="60" w:type="dxa"/>
               <w:left w:w="100" w:type="dxa"/>
               <w:right w:w="100" w:type="dxa"/>
             </w:tcMar>
@@ -341,20 +329,19 @@
             <w:r>
               <w:rPr>
                 <w:b/>
-                <w:color w:val="1E293B"/>
                 <w:sz w:val="19"/>
               </w:rPr>
-              <w:t>GitHub Repository:</w:t>
+              <w:t>Repository:</w:t>
             </w:r>
           </w:p>
         </w:tc>
         <w:tc>
           <w:tcPr>
-            <w:tcW w:type="dxa" w:w="6192"/>
-            <w:shd w:fill="F8FAFC"/>
+            <w:tcW w:type="dxa" w:w="6480"/>
+            <w:shd w:fill="F8F8F8"/>
             <w:tcMar>
-              <w:top w:w="70" w:type="dxa"/>
-              <w:bottom w:w="70" w:type="dxa"/>
+              <w:top w:w="60" w:type="dxa"/>
+              <w:bottom w:w="60" w:type="dxa"/>
               <w:left w:w="100" w:type="dxa"/>
               <w:right w:w="100" w:type="dxa"/>
             </w:tcMar>
@@ -365,7 +352,6 @@
             </w:pPr>
             <w:r>
               <w:rPr>
-                <w:color w:val="334155"/>
                 <w:sz w:val="19"/>
               </w:rPr>
               <w:t>github.com/taybro-o/web-engineering-lab</w:t>
@@ -375,19 +361,6 @@
       </w:tr>
     </w:tbl>
     <w:p>
-      <w:pPr>
-        <w:spacing w:before="800" w:after="0"/>
-        <w:jc w:val="center"/>
-      </w:pPr>
-      <w:r>
-        <w:rPr>
-          <w:color w:val="64748B"/>
-          <w:sz w:val="17"/>
-        </w:rPr>
-        <w:t>Note: All hands-on tasks, responsive layout drills, and positioning tests have been implemented, tested locally in Google Chrome DevTools, and committed to the GitHub repository under Week 04/.</w:t>
-      </w:r>
-    </w:p>
-    <w:p>
       <w:r>
         <w:br w:type="page"/>
       </w:r>
@@ -395,15 +368,14 @@
     <w:p>
       <w:pPr>
         <w:keepNext/>
-        <w:spacing w:before="240" w:after="60"/>
+        <w:spacing w:before="200" w:after="60"/>
       </w:pPr>
       <w:r>
         <w:rPr>
           <w:b/>
-          <w:color w:val="1A237E"/>
-          <w:sz w:val="23"/>
+          <w:sz w:val="22"/>
         </w:rPr>
-        <w:t>1. Warm-up: Flexbox (1D) vs Grid (2D)</w:t>
+        <w:t>1. Warm-up: Flexbox vs Grid (warmup.html)</w:t>
       </w:r>
     </w:p>
     <w:p>
@@ -412,17 +384,9 @@
       </w:pPr>
       <w:r>
         <w:rPr>
-          <w:b/>
           <w:sz w:val="19"/>
         </w:rPr>
-        <w:t xml:space="preserve">Goal &amp; Execution: </w:t>
-      </w:r>
-      <w:r>
-        <w:rPr>
-          <w:color w:val="282828"/>
-          <w:sz w:val="19"/>
-        </w:rPr>
-        <w:t>Opened warmup.html to compare how Flexbox and Grid handle identical elements. Added a seventh box G to both sections and tested flex-direction: column on the flex container.</w:t>
+        <w:t>I opened warmup.html with Live Server to compare Flexbox and Grid with the same boxes.</w:t>
       </w:r>
     </w:p>
     <w:p>
@@ -438,10 +402,9 @@
       </w:r>
       <w:r>
         <w:rPr>
-          <w:color w:val="282828"/>
           <w:sz w:val="19"/>
         </w:rPr>
-        <w:t>In Flexbox (display: flex), all 7 boxes (A to G) remained in a single horizontal row, shrinking in width to fit. In CSS Grid (grid-template-columns: 1fr 1fr 1fr), box G automatically wrapped and started a new 3rd row right under box A.</w:t>
+        <w:t>In Flexbox (display: flex), all 7 boxes (A to G) stayed in one horizontal line and got thinner to fit. In Grid (grid-template-columns: 1fr 1fr 1fr), box G wrapped to a 3rd row right under box A.</w:t>
       </w:r>
     </w:p>
     <w:p>
@@ -457,10 +420,9 @@
       </w:r>
       <w:r>
         <w:rPr>
-          <w:color w:val="282828"/>
           <w:sz w:val="19"/>
         </w:rPr>
-        <w:t>Adding flex-direction: column turned the flex section into a single vertical column. The Grid section remained unaffected.</w:t>
+        <w:t>Adding flex-direction: column to .flex made the flex section stack vertically as one column. The grid section stayed exactly the same.</w:t>
       </w:r>
     </w:p>
     <w:p>
@@ -472,14 +434,13 @@
           <w:b/>
           <w:sz w:val="19"/>
         </w:rPr>
-        <w:t xml:space="preserve">Core Takeaway: </w:t>
+        <w:t xml:space="preserve">Rule: </w:t>
       </w:r>
       <w:r>
         <w:rPr>
-          <w:color w:val="282828"/>
           <w:sz w:val="19"/>
         </w:rPr>
-        <w:t>Flexbox is 1-dimensional (controls a single axis: row OR column). Grid is 2-dimensional (controls rows AND columns simultaneously).</w:t>
+        <w:t>Flexbox is 1D (row or column), Grid is 2D (rows and columns).</w:t>
       </w:r>
     </w:p>
     <w:p>
@@ -489,10 +450,10 @@
       <w:r>
         <w:rPr>
           <w:b/>
-          <w:color w:val="646464"/>
+          <w:color w:val="505050"/>
           <w:sz w:val="16"/>
         </w:rPr>
-        <w:t>[Week 04/warmup.html]</w:t>
+        <w:t>File: Week 04/warmup.html</w:t>
       </w:r>
     </w:p>
     <w:tbl>
@@ -527,29 +488,13 @@
                 <w:color w:val="141414"/>
                 <w:sz w:val="16"/>
               </w:rPr>
-              <w:t>&lt;!-- warmup.html (excerpt) --&gt;</w:t>
+              <w:t>/* warmup.html */</w:t>
               <w:br/>
-              <w:t>&lt;style&gt;</w:t>
+              <w:t>.flex-row { display: flex; gap: 0.5rem; }</w:t>
               <w:br/>
-              <w:t xml:space="preserve">  .flex-row { display: flex; gap: 0.5rem; }</w:t>
+              <w:t>.flex-col { display: flex; flex-direction: column; gap: 0.5rem; }</w:t>
               <w:br/>
-              <w:t xml:space="preserve">  .flex-col { display: flex; flex-direction: column; gap: 0.5rem; }</w:t>
-              <w:br/>
-              <w:t xml:space="preserve">  .grid     { display: grid; grid-template-columns: 1fr 1fr 1fr; gap: 0.5rem; }</w:t>
-              <w:br/>
-              <w:t>&lt;/style&gt;</w:t>
-              <w:br/>
-              <w:t>&lt;section class="flex-row"&gt;</w:t>
-              <w:br/>
-              <w:t xml:space="preserve">  &lt;div class="box"&gt;A&lt;/div&gt; ... &lt;div class="box"&gt;G&lt;/div&gt;</w:t>
-              <w:br/>
-              <w:t>&lt;/section&gt;</w:t>
-              <w:br/>
-              <w:t>&lt;section class="grid"&gt;</w:t>
-              <w:br/>
-              <w:t xml:space="preserve">  &lt;div class="box"&gt;A&lt;/div&gt; ... &lt;div class="box"&gt;G&lt;/div&gt; &lt;!-- G wraps to 3rd row --&gt;</w:t>
-              <w:br/>
-              <w:t>&lt;/section&gt;</w:t>
+              <w:t>.grid     { display: grid; grid-template-columns: 1fr 1fr 1fr; gap: 0.5rem; }</w:t>
             </w:r>
           </w:p>
         </w:tc>
@@ -563,13 +508,12 @@
     <w:p>
       <w:pPr>
         <w:keepNext/>
-        <w:spacing w:before="240" w:after="60"/>
+        <w:spacing w:before="200" w:after="60"/>
       </w:pPr>
       <w:r>
         <w:rPr>
           <w:b/>
-          <w:color w:val="1A237E"/>
-          <w:sz w:val="23"/>
+          <w:sz w:val="22"/>
         </w:rPr>
         <w:t>2. Class Activity A: Flexbox Gallery (gallery.html)</w:t>
       </w:r>
@@ -580,17 +524,9 @@
       </w:pPr>
       <w:r>
         <w:rPr>
-          <w:b/>
           <w:sz w:val="19"/>
         </w:rPr>
-        <w:t xml:space="preserve">Goal &amp; Implementation: </w:t>
-      </w:r>
-      <w:r>
-        <w:rPr>
-          <w:color w:val="282828"/>
-          <w:sz w:val="19"/>
-        </w:rPr>
-        <w:t>Built a responsive photo gallery using Flexbox with 6 photo cards. Applied display: flex and flex-wrap: wrap with gap: 1rem on .gallery, and flex: 1 1 160px on .photo items.</w:t>
+        <w:t>I created gallery.html with 6 boxes. On .gallery, I added display: flex and flex-wrap: wrap with gap: 1rem. On .photo, I added flex: 1 1 160px so items start around 160px and wrap when screen width decreases.</w:t>
       </w:r>
     </w:p>
     <w:p>
@@ -599,17 +535,9 @@
       </w:pPr>
       <w:r>
         <w:rPr>
-          <w:b/>
           <w:sz w:val="19"/>
         </w:rPr>
-        <w:t xml:space="preserve">Observation: </w:t>
-      </w:r>
-      <w:r>
-        <w:rPr>
-          <w:color w:val="282828"/>
-          <w:sz w:val="19"/>
-        </w:rPr>
-        <w:t>The items prefer an initial width of 160px (flex-basis), but grow (flex-grow: 1) to fill available space or shrink (flex-shrink: 1) before wrapping. Resizing down from desktop to mobile causes cards to reflow from 4 -&gt; 2 -&gt; 1 across, with 0 horizontal scrollbar at 320px.</w:t>
+        <w:t>When resizing the window in DevTools, the boxes wrapped from 4 to 2 to 1 per row. At 320px width there is no horizontal scrollbar.</w:t>
       </w:r>
     </w:p>
     <w:p>
@@ -619,10 +547,10 @@
       <w:r>
         <w:rPr>
           <w:b/>
-          <w:color w:val="646464"/>
+          <w:color w:val="505050"/>
           <w:sz w:val="16"/>
         </w:rPr>
-        <w:t>[Activity A: Flexbox wrapping CSS]</w:t>
+        <w:t>File: Week 04/gallery.html (Activity A)</w:t>
       </w:r>
     </w:p>
     <w:tbl>
@@ -665,13 +593,13 @@
               <w:br/>
               <w:t xml:space="preserve">  flex-wrap: wrap;</w:t>
               <w:br/>
-              <w:t xml:space="preserve">  gap: 1rem; /* Container gap preferred over item margins */</w:t>
+              <w:t xml:space="preserve">  gap: 1rem;</w:t>
               <w:br/>
               <w:t>}</w:t>
               <w:br/>
               <w:t>.photo {</w:t>
               <w:br/>
-              <w:t xml:space="preserve">  flex: 1 1 160px; /* grow: 1, shrink: 1, basis: 160px */</w:t>
+              <w:t xml:space="preserve">  flex: 1 1 160px;</w:t>
               <w:br/>
               <w:t xml:space="preserve">  background: #ddd;</w:t>
               <w:br/>
@@ -693,15 +621,25 @@
     <w:p>
       <w:pPr>
         <w:keepNext/>
-        <w:spacing w:before="240" w:after="60"/>
+        <w:spacing w:before="200" w:after="60"/>
       </w:pPr>
       <w:r>
         <w:rPr>
           <w:b/>
-          <w:color w:val="1A237E"/>
-          <w:sz w:val="23"/>
+          <w:sz w:val="22"/>
         </w:rPr>
-        <w:t>3. Class Activity B: justify-content Space Distribution</w:t>
+        <w:t>3. Class Activity B: justify-content Testing</w:t>
+      </w:r>
+    </w:p>
+    <w:p>
+      <w:pPr>
+        <w:spacing w:before="0" w:after="80" w:line="276" w:lineRule="auto"/>
+      </w:pPr>
+      <w:r>
+        <w:rPr>
+          <w:sz w:val="19"/>
+        </w:rPr>
+        <w:t>In gallery.html, I set .photo { flex: 0 0 120px; } so items have a fixed width and leave extra space on the main axis. Then I tested each justify-content value on .gallery:</w:t>
       </w:r>
     </w:p>
     <w:p>
@@ -713,353 +651,13 @@
           <w:b/>
           <w:sz w:val="19"/>
         </w:rPr>
-        <w:t xml:space="preserve">Goal &amp; Testing: </w:t>
+        <w:t xml:space="preserve">• flex-start: </w:t>
       </w:r>
       <w:r>
         <w:rPr>
-          <w:color w:val="282828"/>
           <w:sz w:val="19"/>
         </w:rPr>
-        <w:t>Set .photo { flex: 0 0 120px; } so items have a fixed width and cannot grow to absorb remaining space, allowing clear observation of justify-content on the main axis.</w:t>
-      </w:r>
-    </w:p>
-    <w:tbl>
-      <w:tblPr>
-        <w:tblW w:type="auto" w:w="0"/>
-        <w:jc w:val="center"/>
-        <w:tblLayout w:type="fixed"/>
-        <w:tblLook w:firstColumn="1" w:firstRow="1" w:lastColumn="0" w:lastRow="0" w:noHBand="0" w:noVBand="1" w:val="04A0"/>
-      </w:tblPr>
-      <w:tblGrid>
-        <w:gridCol w:w="5400"/>
-        <w:gridCol w:w="5400"/>
-      </w:tblGrid>
-      <w:tr>
-        <w:tc>
-          <w:tcPr>
-            <w:tcW w:type="dxa" w:w="2160"/>
-            <w:shd w:fill="F8FAFC"/>
-            <w:tcMar>
-              <w:top w:w="60" w:type="dxa"/>
-              <w:bottom w:w="60" w:type="dxa"/>
-              <w:left w:w="80" w:type="dxa"/>
-              <w:right w:w="80" w:type="dxa"/>
-            </w:tcMar>
-          </w:tcPr>
-          <w:p>
-            <w:pPr>
-              <w:spacing w:before="0" w:after="0"/>
-            </w:pPr>
-            <w:r>
-              <w:rPr>
-                <w:b/>
-                <w:sz w:val="17"/>
-              </w:rPr>
-              <w:t>flex-start</w:t>
-            </w:r>
-          </w:p>
-        </w:tc>
-        <w:tc>
-          <w:tcPr>
-            <w:tcW w:type="dxa" w:w="7200"/>
-            <w:shd w:fill="F8FAFC"/>
-            <w:tcMar>
-              <w:top w:w="60" w:type="dxa"/>
-              <w:bottom w:w="60" w:type="dxa"/>
-              <w:left w:w="80" w:type="dxa"/>
-              <w:right w:w="80" w:type="dxa"/>
-            </w:tcMar>
-          </w:tcPr>
-          <w:p>
-            <w:pPr>
-              <w:spacing w:before="0" w:after="0"/>
-            </w:pPr>
-            <w:r>
-              <w:rPr>
-                <w:sz w:val="17"/>
-              </w:rPr>
-              <w:t>Items pack tightly at the start (left) of container; all unused space stays at the far right.</w:t>
-            </w:r>
-          </w:p>
-        </w:tc>
-      </w:tr>
-      <w:tr>
-        <w:tc>
-          <w:tcPr>
-            <w:tcW w:type="dxa" w:w="2160"/>
-            <w:shd w:fill="FFFFFF"/>
-            <w:tcMar>
-              <w:top w:w="60" w:type="dxa"/>
-              <w:bottom w:w="60" w:type="dxa"/>
-              <w:left w:w="80" w:type="dxa"/>
-              <w:right w:w="80" w:type="dxa"/>
-            </w:tcMar>
-          </w:tcPr>
-          <w:p>
-            <w:pPr>
-              <w:spacing w:before="0" w:after="0"/>
-            </w:pPr>
-            <w:r>
-              <w:rPr>
-                <w:b/>
-                <w:sz w:val="17"/>
-              </w:rPr>
-              <w:t>center</w:t>
-            </w:r>
-          </w:p>
-        </w:tc>
-        <w:tc>
-          <w:tcPr>
-            <w:tcW w:type="dxa" w:w="7200"/>
-            <w:shd w:fill="FFFFFF"/>
-            <w:tcMar>
-              <w:top w:w="60" w:type="dxa"/>
-              <w:bottom w:w="60" w:type="dxa"/>
-              <w:left w:w="80" w:type="dxa"/>
-              <w:right w:w="80" w:type="dxa"/>
-            </w:tcMar>
-          </w:tcPr>
-          <w:p>
-            <w:pPr>
-              <w:spacing w:before="0" w:after="0"/>
-            </w:pPr>
-            <w:r>
-              <w:rPr>
-                <w:sz w:val="17"/>
-              </w:rPr>
-              <w:t>Items cluster together in the center; leftover space is evenly split on left and right edges.</w:t>
-            </w:r>
-          </w:p>
-        </w:tc>
-      </w:tr>
-      <w:tr>
-        <w:tc>
-          <w:tcPr>
-            <w:tcW w:type="dxa" w:w="2160"/>
-            <w:shd w:fill="F8FAFC"/>
-            <w:tcMar>
-              <w:top w:w="60" w:type="dxa"/>
-              <w:bottom w:w="60" w:type="dxa"/>
-              <w:left w:w="80" w:type="dxa"/>
-              <w:right w:w="80" w:type="dxa"/>
-            </w:tcMar>
-          </w:tcPr>
-          <w:p>
-            <w:pPr>
-              <w:spacing w:before="0" w:after="0"/>
-            </w:pPr>
-            <w:r>
-              <w:rPr>
-                <w:b/>
-                <w:sz w:val="17"/>
-              </w:rPr>
-              <w:t>flex-end</w:t>
-            </w:r>
-          </w:p>
-        </w:tc>
-        <w:tc>
-          <w:tcPr>
-            <w:tcW w:type="dxa" w:w="7200"/>
-            <w:shd w:fill="F8FAFC"/>
-            <w:tcMar>
-              <w:top w:w="60" w:type="dxa"/>
-              <w:bottom w:w="60" w:type="dxa"/>
-              <w:left w:w="80" w:type="dxa"/>
-              <w:right w:w="80" w:type="dxa"/>
-            </w:tcMar>
-          </w:tcPr>
-          <w:p>
-            <w:pPr>
-              <w:spacing w:before="0" w:after="0"/>
-            </w:pPr>
-            <w:r>
-              <w:rPr>
-                <w:sz w:val="17"/>
-              </w:rPr>
-              <w:t>Items pack tightly at the end (right); all leftover space sits at the beginning.</w:t>
-            </w:r>
-          </w:p>
-        </w:tc>
-      </w:tr>
-      <w:tr>
-        <w:tc>
-          <w:tcPr>
-            <w:tcW w:type="dxa" w:w="2160"/>
-            <w:shd w:fill="FFFFFF"/>
-            <w:tcMar>
-              <w:top w:w="60" w:type="dxa"/>
-              <w:bottom w:w="60" w:type="dxa"/>
-              <w:left w:w="80" w:type="dxa"/>
-              <w:right w:w="80" w:type="dxa"/>
-            </w:tcMar>
-          </w:tcPr>
-          <w:p>
-            <w:pPr>
-              <w:spacing w:before="0" w:after="0"/>
-            </w:pPr>
-            <w:r>
-              <w:rPr>
-                <w:b/>
-                <w:sz w:val="17"/>
-              </w:rPr>
-              <w:t>space-between</w:t>
-            </w:r>
-          </w:p>
-        </w:tc>
-        <w:tc>
-          <w:tcPr>
-            <w:tcW w:type="dxa" w:w="7200"/>
-            <w:shd w:fill="FFFFFF"/>
-            <w:tcMar>
-              <w:top w:w="60" w:type="dxa"/>
-              <w:bottom w:w="60" w:type="dxa"/>
-              <w:left w:w="80" w:type="dxa"/>
-              <w:right w:w="80" w:type="dxa"/>
-            </w:tcMar>
-          </w:tcPr>
-          <w:p>
-            <w:pPr>
-              <w:spacing w:before="0" w:after="0"/>
-            </w:pPr>
-            <w:r>
-              <w:rPr>
-                <w:sz w:val="17"/>
-              </w:rPr>
-              <w:t>First item is flush left, last item is flush right; leftover space is distributed equally between items.</w:t>
-            </w:r>
-          </w:p>
-        </w:tc>
-      </w:tr>
-      <w:tr>
-        <w:tc>
-          <w:tcPr>
-            <w:tcW w:type="dxa" w:w="2160"/>
-            <w:shd w:fill="F8FAFC"/>
-            <w:tcMar>
-              <w:top w:w="60" w:type="dxa"/>
-              <w:bottom w:w="60" w:type="dxa"/>
-              <w:left w:w="80" w:type="dxa"/>
-              <w:right w:w="80" w:type="dxa"/>
-            </w:tcMar>
-          </w:tcPr>
-          <w:p>
-            <w:pPr>
-              <w:spacing w:before="0" w:after="0"/>
-            </w:pPr>
-            <w:r>
-              <w:rPr>
-                <w:b/>
-                <w:sz w:val="17"/>
-              </w:rPr>
-              <w:t>space-around</w:t>
-            </w:r>
-          </w:p>
-        </w:tc>
-        <w:tc>
-          <w:tcPr>
-            <w:tcW w:type="dxa" w:w="7200"/>
-            <w:shd w:fill="F8FAFC"/>
-            <w:tcMar>
-              <w:top w:w="60" w:type="dxa"/>
-              <w:bottom w:w="60" w:type="dxa"/>
-              <w:left w:w="80" w:type="dxa"/>
-              <w:right w:w="80" w:type="dxa"/>
-            </w:tcMar>
-          </w:tcPr>
-          <w:p>
-            <w:pPr>
-              <w:spacing w:before="0" w:after="0"/>
-            </w:pPr>
-            <w:r>
-              <w:rPr>
-                <w:sz w:val="17"/>
-              </w:rPr>
-              <w:t>Items have equal space on both sides (space between items is twice the space at the edges).</w:t>
-            </w:r>
-          </w:p>
-        </w:tc>
-      </w:tr>
-      <w:tr>
-        <w:tc>
-          <w:tcPr>
-            <w:tcW w:type="dxa" w:w="2160"/>
-            <w:shd w:fill="FFFFFF"/>
-            <w:tcMar>
-              <w:top w:w="60" w:type="dxa"/>
-              <w:bottom w:w="60" w:type="dxa"/>
-              <w:left w:w="80" w:type="dxa"/>
-              <w:right w:w="80" w:type="dxa"/>
-            </w:tcMar>
-          </w:tcPr>
-          <w:p>
-            <w:pPr>
-              <w:spacing w:before="0" w:after="0"/>
-            </w:pPr>
-            <w:r>
-              <w:rPr>
-                <w:b/>
-                <w:sz w:val="17"/>
-              </w:rPr>
-              <w:t>space-evenly</w:t>
-            </w:r>
-          </w:p>
-        </w:tc>
-        <w:tc>
-          <w:tcPr>
-            <w:tcW w:type="dxa" w:w="7200"/>
-            <w:shd w:fill="FFFFFF"/>
-            <w:tcMar>
-              <w:top w:w="60" w:type="dxa"/>
-              <w:bottom w:w="60" w:type="dxa"/>
-              <w:left w:w="80" w:type="dxa"/>
-              <w:right w:w="80" w:type="dxa"/>
-            </w:tcMar>
-          </w:tcPr>
-          <w:p>
-            <w:pPr>
-              <w:spacing w:before="0" w:after="0"/>
-            </w:pPr>
-            <w:r>
-              <w:rPr>
-                <w:sz w:val="17"/>
-              </w:rPr>
-              <w:t>All spaces between items and between items and edges are strictly equal.</w:t>
-            </w:r>
-          </w:p>
-        </w:tc>
-      </w:tr>
-      <w:tr>
-        <w:tc>
-          <w:tcPr>
-            <w:tcW w:type="dxa" w:w="5400"/>
-          </w:tcPr>
-          <w:p/>
-        </w:tc>
-        <w:tc>
-          <w:tcPr>
-            <w:tcW w:type="dxa" w:w="5400"/>
-          </w:tcPr>
-          <w:p/>
-        </w:tc>
-      </w:tr>
-    </w:tbl>
-    <w:p>
-      <w:pPr>
-        <w:spacing w:after="80"/>
-      </w:pPr>
-    </w:p>
-    <w:p>
-      <w:pPr>
-        <w:keepNext/>
-        <w:spacing w:before="240" w:after="60"/>
-      </w:pPr>
-      <w:r>
-        <w:rPr>
-          <w:b/>
-          <w:color w:val="1A237E"/>
-          <w:sz w:val="23"/>
-        </w:rPr>
-        <w:t>4. Class Activity C: Responsive CSS Grid (grid-gallery.html)</w:t>
+        <w:t>Boxes pack at the left; extra space stays on the right.</w:t>
       </w:r>
     </w:p>
     <w:p>
@@ -1071,14 +669,120 @@
           <w:b/>
           <w:sz w:val="19"/>
         </w:rPr>
-        <w:t xml:space="preserve">Goal &amp; Implementation: </w:t>
+        <w:t xml:space="preserve">• center: </w:t>
       </w:r>
       <w:r>
         <w:rPr>
-          <w:color w:val="282828"/>
           <w:sz w:val="19"/>
         </w:rPr>
-        <w:t>Built a responsive 6-item photo gallery using CSS Grid with auto-fit and minmax. The CSS rule used was: display: grid; grid-template-columns: repeat(auto-fit, minmax(250px, 1fr)); gap: 1rem;.</w:t>
+        <w:t>Boxes move to the center with equal space on left and right.</w:t>
+      </w:r>
+    </w:p>
+    <w:p>
+      <w:pPr>
+        <w:spacing w:before="0" w:after="80" w:line="276" w:lineRule="auto"/>
+      </w:pPr>
+      <w:r>
+        <w:rPr>
+          <w:b/>
+          <w:sz w:val="19"/>
+        </w:rPr>
+        <w:t xml:space="preserve">• flex-end: </w:t>
+      </w:r>
+      <w:r>
+        <w:rPr>
+          <w:sz w:val="19"/>
+        </w:rPr>
+        <w:t>Boxes pack at the right edge; extra space stays on the left.</w:t>
+      </w:r>
+    </w:p>
+    <w:p>
+      <w:pPr>
+        <w:spacing w:before="0" w:after="80" w:line="276" w:lineRule="auto"/>
+      </w:pPr>
+      <w:r>
+        <w:rPr>
+          <w:b/>
+          <w:sz w:val="19"/>
+        </w:rPr>
+        <w:t xml:space="preserve">• space-between: </w:t>
+      </w:r>
+      <w:r>
+        <w:rPr>
+          <w:sz w:val="19"/>
+        </w:rPr>
+        <w:t>First box is at the left edge, last box at the right edge, remaining space split evenly between boxes.</w:t>
+      </w:r>
+    </w:p>
+    <w:p>
+      <w:pPr>
+        <w:spacing w:before="0" w:after="80" w:line="276" w:lineRule="auto"/>
+      </w:pPr>
+      <w:r>
+        <w:rPr>
+          <w:b/>
+          <w:sz w:val="19"/>
+        </w:rPr>
+        <w:t xml:space="preserve">• space-around: </w:t>
+      </w:r>
+      <w:r>
+        <w:rPr>
+          <w:sz w:val="19"/>
+        </w:rPr>
+        <w:t>Equal space on both sides of each box (outer space is half of inner space).</w:t>
+      </w:r>
+    </w:p>
+    <w:p>
+      <w:pPr>
+        <w:spacing w:before="0" w:after="80" w:line="276" w:lineRule="auto"/>
+      </w:pPr>
+      <w:r>
+        <w:rPr>
+          <w:b/>
+          <w:sz w:val="19"/>
+        </w:rPr>
+        <w:t xml:space="preserve">• space-evenly: </w:t>
+      </w:r>
+      <w:r>
+        <w:rPr>
+          <w:sz w:val="19"/>
+        </w:rPr>
+        <w:t>Equal space between all boxes and edges.</w:t>
+      </w:r>
+    </w:p>
+    <w:p>
+      <w:pPr>
+        <w:keepNext/>
+        <w:spacing w:before="200" w:after="60"/>
+      </w:pPr>
+      <w:r>
+        <w:rPr>
+          <w:b/>
+          <w:sz w:val="22"/>
+        </w:rPr>
+        <w:t>4. Class Activity C: Grid Gallery (grid-gallery.html)</w:t>
+      </w:r>
+    </w:p>
+    <w:p>
+      <w:pPr>
+        <w:spacing w:before="0" w:after="80" w:line="276" w:lineRule="auto"/>
+      </w:pPr>
+      <w:r>
+        <w:rPr>
+          <w:sz w:val="19"/>
+        </w:rPr>
+        <w:t>Created grid-gallery.html with 6 photo boxes using CSS Grid instead of Flexbox.</w:t>
+      </w:r>
+    </w:p>
+    <w:p>
+      <w:pPr>
+        <w:spacing w:before="0" w:after="80" w:line="276" w:lineRule="auto"/>
+      </w:pPr>
+      <w:r>
+        <w:rPr>
+          <w:sz w:val="19"/>
+        </w:rPr>
+        <w:t>Added display: grid; grid-template-columns: repeat(auto-fit, minmax(250px, 1fr)); gap: 1rem; on .gallery.</w:t>
       </w:r>
     </w:p>
     <w:p>
@@ -1094,10 +798,9 @@
       </w:r>
       <w:r>
         <w:rPr>
-          <w:color w:val="282828"/>
           <w:sz w:val="19"/>
         </w:rPr>
-        <w:t>Zero media queries were needed. The browser automatically calculated how many columns of at least 250px could fit across the container width and expanded them with 1fr. On resizing, columns reflowed from 4 -&gt; 3 -&gt; 2 -&gt; 1 without overflow at 320px.</w:t>
+        <w:t>The layout reflows automatically as the browser width changes. It shows 4 columns on large screens, then 3, 2, and 1 column on small screens down to 320px with no horizontal scrollbar and no media queries needed.</w:t>
       </w:r>
     </w:p>
     <w:p>
@@ -1107,10 +810,10 @@
       <w:r>
         <w:rPr>
           <w:b/>
-          <w:color w:val="646464"/>
+          <w:color w:val="505050"/>
           <w:sz w:val="16"/>
         </w:rPr>
-        <w:t>[Activity C: CSS Grid auto-fit]</w:t>
+        <w:t>File: Week 04/grid-gallery.html</w:t>
       </w:r>
     </w:p>
     <w:tbl>
@@ -1156,16 +859,6 @@
               <w:t xml:space="preserve">  gap: 1rem;</w:t>
               <w:br/>
               <w:t>}</w:t>
-              <w:br/>
-              <w:t>.photo {</w:t>
-              <w:br/>
-              <w:t xml:space="preserve">  background: #ddd;</w:t>
-              <w:br/>
-              <w:t xml:space="preserve">  padding: 2.5rem 1rem;</w:t>
-              <w:br/>
-              <w:t xml:space="preserve">  text-align: center;</w:t>
-              <w:br/>
-              <w:t>}</w:t>
             </w:r>
           </w:p>
         </w:tc>
@@ -1179,15 +872,25 @@
     <w:p>
       <w:pPr>
         <w:keepNext/>
-        <w:spacing w:before="240" w:after="60"/>
+        <w:spacing w:before="200" w:after="60"/>
       </w:pPr>
       <w:r>
         <w:rPr>
           <w:b/>
-          <w:color w:val="1A237E"/>
-          <w:sz w:val="23"/>
+          <w:sz w:val="22"/>
         </w:rPr>
         <w:t>5. Class Activity D: Mobile-First Breakpoints (breakpoints.html)</w:t>
+      </w:r>
+    </w:p>
+    <w:p>
+      <w:pPr>
+        <w:spacing w:before="0" w:after="80" w:line="276" w:lineRule="auto"/>
+      </w:pPr>
+      <w:r>
+        <w:rPr>
+          <w:sz w:val="19"/>
+        </w:rPr>
+        <w:t>In breakpoints.html, I removed auto-fit and wrote mobile-first media queries with min-width:</w:t>
       </w:r>
     </w:p>
     <w:p>
@@ -1199,553 +902,13 @@
           <w:b/>
           <w:sz w:val="19"/>
         </w:rPr>
-        <w:t xml:space="preserve">Goal &amp; Implementation: </w:t>
+        <w:t xml:space="preserve">• Base (no query, &lt; 640px): </w:t>
       </w:r>
       <w:r>
         <w:rPr>
-          <w:color w:val="282828"/>
           <w:sz w:val="19"/>
         </w:rPr>
-        <w:t>Replaced auto-fit with explicit mobile-first min-width media queries. The mobile base starts at 1 column with no query, and progressively expands column count as screen width increases.</w:t>
-      </w:r>
-    </w:p>
-    <w:tbl>
-      <w:tblPr>
-        <w:tblW w:type="auto" w:w="0"/>
-        <w:jc w:val="center"/>
-        <w:tblLayout w:type="fixed"/>
-        <w:tblLook w:firstColumn="1" w:firstRow="1" w:lastColumn="0" w:lastRow="0" w:noHBand="0" w:noVBand="1" w:val="04A0"/>
-      </w:tblPr>
-      <w:tblGrid>
-        <w:gridCol w:w="2700"/>
-        <w:gridCol w:w="2700"/>
-        <w:gridCol w:w="2700"/>
-        <w:gridCol w:w="2700"/>
-      </w:tblGrid>
-      <w:tr>
-        <w:tc>
-          <w:tcPr>
-            <w:tcW w:type="dxa" w:w="2160"/>
-            <w:shd w:fill="F8FAFC"/>
-            <w:tcMar>
-              <w:top w:w="50" w:type="dxa"/>
-              <w:bottom w:w="50" w:type="dxa"/>
-              <w:left w:w="60" w:type="dxa"/>
-              <w:right w:w="60" w:type="dxa"/>
-            </w:tcMar>
-          </w:tcPr>
-          <w:p>
-            <w:pPr>
-              <w:spacing w:before="0" w:after="0"/>
-            </w:pPr>
-            <w:r>
-              <w:rPr>
-                <w:b/>
-                <w:sz w:val="16"/>
-              </w:rPr>
-              <w:t>Base (&lt; 640px)</w:t>
-            </w:r>
-          </w:p>
-        </w:tc>
-        <w:tc>
-          <w:tcPr>
-            <w:tcW w:type="dxa" w:w="2880"/>
-            <w:shd w:fill="F8FAFC"/>
-            <w:tcMar>
-              <w:top w:w="50" w:type="dxa"/>
-              <w:bottom w:w="50" w:type="dxa"/>
-              <w:left w:w="60" w:type="dxa"/>
-              <w:right w:w="60" w:type="dxa"/>
-            </w:tcMar>
-          </w:tcPr>
-          <w:p>
-            <w:pPr>
-              <w:spacing w:before="0" w:after="0"/>
-            </w:pPr>
-            <w:r>
-              <w:rPr>
-                <w:sz w:val="16"/>
-              </w:rPr>
-              <w:t>None (Base CSS)</w:t>
-            </w:r>
-          </w:p>
-        </w:tc>
-        <w:tc>
-          <w:tcPr>
-            <w:tcW w:type="dxa" w:w="1728"/>
-            <w:shd w:fill="F8FAFC"/>
-            <w:tcMar>
-              <w:top w:w="50" w:type="dxa"/>
-              <w:bottom w:w="50" w:type="dxa"/>
-              <w:left w:w="60" w:type="dxa"/>
-              <w:right w:w="60" w:type="dxa"/>
-            </w:tcMar>
-          </w:tcPr>
-          <w:p>
-            <w:pPr>
-              <w:spacing w:before="0" w:after="0"/>
-            </w:pPr>
-            <w:r>
-              <w:rPr>
-                <w:b/>
-                <w:sz w:val="16"/>
-              </w:rPr>
-              <w:t>1 col</w:t>
-            </w:r>
-          </w:p>
-        </w:tc>
-        <w:tc>
-          <w:tcPr>
-            <w:tcW w:type="dxa" w:w="2592"/>
-            <w:shd w:fill="F8FAFC"/>
-            <w:tcMar>
-              <w:top w:w="50" w:type="dxa"/>
-              <w:bottom w:w="50" w:type="dxa"/>
-              <w:left w:w="60" w:type="dxa"/>
-              <w:right w:w="60" w:type="dxa"/>
-            </w:tcMar>
-          </w:tcPr>
-          <w:p>
-            <w:pPr>
-              <w:spacing w:before="0" w:after="0"/>
-            </w:pPr>
-            <w:r>
-              <w:rPr>
-                <w:sz w:val="16"/>
-              </w:rPr>
-              <w:t>1 column stacked layout for mobile</w:t>
-            </w:r>
-          </w:p>
-        </w:tc>
-      </w:tr>
-      <w:tr>
-        <w:tc>
-          <w:tcPr>
-            <w:tcW w:type="dxa" w:w="2160"/>
-            <w:shd w:fill="FFFFFF"/>
-            <w:tcMar>
-              <w:top w:w="50" w:type="dxa"/>
-              <w:bottom w:w="50" w:type="dxa"/>
-              <w:left w:w="60" w:type="dxa"/>
-              <w:right w:w="60" w:type="dxa"/>
-            </w:tcMar>
-          </w:tcPr>
-          <w:p>
-            <w:pPr>
-              <w:spacing w:before="0" w:after="0"/>
-            </w:pPr>
-            <w:r>
-              <w:rPr>
-                <w:b/>
-                <w:sz w:val="16"/>
-              </w:rPr>
-              <w:t>Small (640px)</w:t>
-            </w:r>
-          </w:p>
-        </w:tc>
-        <w:tc>
-          <w:tcPr>
-            <w:tcW w:type="dxa" w:w="2880"/>
-            <w:shd w:fill="FFFFFF"/>
-            <w:tcMar>
-              <w:top w:w="50" w:type="dxa"/>
-              <w:bottom w:w="50" w:type="dxa"/>
-              <w:left w:w="60" w:type="dxa"/>
-              <w:right w:w="60" w:type="dxa"/>
-            </w:tcMar>
-          </w:tcPr>
-          <w:p>
-            <w:pPr>
-              <w:spacing w:before="0" w:after="0"/>
-            </w:pPr>
-            <w:r>
-              <w:rPr>
-                <w:sz w:val="16"/>
-              </w:rPr>
-              <w:t>@media (min-width: 640px)</w:t>
-            </w:r>
-          </w:p>
-        </w:tc>
-        <w:tc>
-          <w:tcPr>
-            <w:tcW w:type="dxa" w:w="1728"/>
-            <w:shd w:fill="FFFFFF"/>
-            <w:tcMar>
-              <w:top w:w="50" w:type="dxa"/>
-              <w:bottom w:w="50" w:type="dxa"/>
-              <w:left w:w="60" w:type="dxa"/>
-              <w:right w:w="60" w:type="dxa"/>
-            </w:tcMar>
-          </w:tcPr>
-          <w:p>
-            <w:pPr>
-              <w:spacing w:before="0" w:after="0"/>
-            </w:pPr>
-            <w:r>
-              <w:rPr>
-                <w:b/>
-                <w:sz w:val="16"/>
-              </w:rPr>
-              <w:t>2 cols</w:t>
-            </w:r>
-          </w:p>
-        </w:tc>
-        <w:tc>
-          <w:tcPr>
-            <w:tcW w:type="dxa" w:w="2592"/>
-            <w:shd w:fill="FFFFFF"/>
-            <w:tcMar>
-              <w:top w:w="50" w:type="dxa"/>
-              <w:bottom w:w="50" w:type="dxa"/>
-              <w:left w:w="60" w:type="dxa"/>
-              <w:right w:w="60" w:type="dxa"/>
-            </w:tcMar>
-          </w:tcPr>
-          <w:p>
-            <w:pPr>
-              <w:spacing w:before="0" w:after="0"/>
-            </w:pPr>
-            <w:r>
-              <w:rPr>
-                <w:sz w:val="16"/>
-              </w:rPr>
-              <w:t>2 columns for large phones/small tablets</w:t>
-            </w:r>
-          </w:p>
-        </w:tc>
-      </w:tr>
-      <w:tr>
-        <w:tc>
-          <w:tcPr>
-            <w:tcW w:type="dxa" w:w="2160"/>
-            <w:shd w:fill="F8FAFC"/>
-            <w:tcMar>
-              <w:top w:w="50" w:type="dxa"/>
-              <w:bottom w:w="50" w:type="dxa"/>
-              <w:left w:w="60" w:type="dxa"/>
-              <w:right w:w="60" w:type="dxa"/>
-            </w:tcMar>
-          </w:tcPr>
-          <w:p>
-            <w:pPr>
-              <w:spacing w:before="0" w:after="0"/>
-            </w:pPr>
-            <w:r>
-              <w:rPr>
-                <w:b/>
-                <w:sz w:val="16"/>
-              </w:rPr>
-              <w:t>Medium (768px)</w:t>
-            </w:r>
-          </w:p>
-        </w:tc>
-        <w:tc>
-          <w:tcPr>
-            <w:tcW w:type="dxa" w:w="2880"/>
-            <w:shd w:fill="F8FAFC"/>
-            <w:tcMar>
-              <w:top w:w="50" w:type="dxa"/>
-              <w:bottom w:w="50" w:type="dxa"/>
-              <w:left w:w="60" w:type="dxa"/>
-              <w:right w:w="60" w:type="dxa"/>
-            </w:tcMar>
-          </w:tcPr>
-          <w:p>
-            <w:pPr>
-              <w:spacing w:before="0" w:after="0"/>
-            </w:pPr>
-            <w:r>
-              <w:rPr>
-                <w:sz w:val="16"/>
-              </w:rPr>
-              <w:t>@media (min-width: 768px)</w:t>
-            </w:r>
-          </w:p>
-        </w:tc>
-        <w:tc>
-          <w:tcPr>
-            <w:tcW w:type="dxa" w:w="1728"/>
-            <w:shd w:fill="F8FAFC"/>
-            <w:tcMar>
-              <w:top w:w="50" w:type="dxa"/>
-              <w:bottom w:w="50" w:type="dxa"/>
-              <w:left w:w="60" w:type="dxa"/>
-              <w:right w:w="60" w:type="dxa"/>
-            </w:tcMar>
-          </w:tcPr>
-          <w:p>
-            <w:pPr>
-              <w:spacing w:before="0" w:after="0"/>
-            </w:pPr>
-            <w:r>
-              <w:rPr>
-                <w:b/>
-                <w:sz w:val="16"/>
-              </w:rPr>
-              <w:t>3 cols</w:t>
-            </w:r>
-          </w:p>
-        </w:tc>
-        <w:tc>
-          <w:tcPr>
-            <w:tcW w:type="dxa" w:w="2592"/>
-            <w:shd w:fill="F8FAFC"/>
-            <w:tcMar>
-              <w:top w:w="50" w:type="dxa"/>
-              <w:bottom w:w="50" w:type="dxa"/>
-              <w:left w:w="60" w:type="dxa"/>
-              <w:right w:w="60" w:type="dxa"/>
-            </w:tcMar>
-          </w:tcPr>
-          <w:p>
-            <w:pPr>
-              <w:spacing w:before="0" w:after="0"/>
-            </w:pPr>
-            <w:r>
-              <w:rPr>
-                <w:sz w:val="16"/>
-              </w:rPr>
-              <w:t>3 columns for tablet portrait</w:t>
-            </w:r>
-          </w:p>
-        </w:tc>
-      </w:tr>
-      <w:tr>
-        <w:tc>
-          <w:tcPr>
-            <w:tcW w:type="dxa" w:w="2160"/>
-            <w:shd w:fill="FFFFFF"/>
-            <w:tcMar>
-              <w:top w:w="50" w:type="dxa"/>
-              <w:bottom w:w="50" w:type="dxa"/>
-              <w:left w:w="60" w:type="dxa"/>
-              <w:right w:w="60" w:type="dxa"/>
-            </w:tcMar>
-          </w:tcPr>
-          <w:p>
-            <w:pPr>
-              <w:spacing w:before="0" w:after="0"/>
-            </w:pPr>
-            <w:r>
-              <w:rPr>
-                <w:b/>
-                <w:sz w:val="16"/>
-              </w:rPr>
-              <w:t>Large (1024px)</w:t>
-            </w:r>
-          </w:p>
-        </w:tc>
-        <w:tc>
-          <w:tcPr>
-            <w:tcW w:type="dxa" w:w="2880"/>
-            <w:shd w:fill="FFFFFF"/>
-            <w:tcMar>
-              <w:top w:w="50" w:type="dxa"/>
-              <w:bottom w:w="50" w:type="dxa"/>
-              <w:left w:w="60" w:type="dxa"/>
-              <w:right w:w="60" w:type="dxa"/>
-            </w:tcMar>
-          </w:tcPr>
-          <w:p>
-            <w:pPr>
-              <w:spacing w:before="0" w:after="0"/>
-            </w:pPr>
-            <w:r>
-              <w:rPr>
-                <w:sz w:val="16"/>
-              </w:rPr>
-              <w:t>@media (min-width: 1024px)</w:t>
-            </w:r>
-          </w:p>
-        </w:tc>
-        <w:tc>
-          <w:tcPr>
-            <w:tcW w:type="dxa" w:w="1728"/>
-            <w:shd w:fill="FFFFFF"/>
-            <w:tcMar>
-              <w:top w:w="50" w:type="dxa"/>
-              <w:bottom w:w="50" w:type="dxa"/>
-              <w:left w:w="60" w:type="dxa"/>
-              <w:right w:w="60" w:type="dxa"/>
-            </w:tcMar>
-          </w:tcPr>
-          <w:p>
-            <w:pPr>
-              <w:spacing w:before="0" w:after="0"/>
-            </w:pPr>
-            <w:r>
-              <w:rPr>
-                <w:b/>
-                <w:sz w:val="16"/>
-              </w:rPr>
-              <w:t>4 cols</w:t>
-            </w:r>
-          </w:p>
-        </w:tc>
-        <w:tc>
-          <w:tcPr>
-            <w:tcW w:type="dxa" w:w="2592"/>
-            <w:shd w:fill="FFFFFF"/>
-            <w:tcMar>
-              <w:top w:w="50" w:type="dxa"/>
-              <w:bottom w:w="50" w:type="dxa"/>
-              <w:left w:w="60" w:type="dxa"/>
-              <w:right w:w="60" w:type="dxa"/>
-            </w:tcMar>
-          </w:tcPr>
-          <w:p>
-            <w:pPr>
-              <w:spacing w:before="0" w:after="0"/>
-            </w:pPr>
-            <w:r>
-              <w:rPr>
-                <w:sz w:val="16"/>
-              </w:rPr>
-              <w:t>4 columns for small laptops/landscape</w:t>
-            </w:r>
-          </w:p>
-        </w:tc>
-      </w:tr>
-      <w:tr>
-        <w:tc>
-          <w:tcPr>
-            <w:tcW w:type="dxa" w:w="2160"/>
-            <w:shd w:fill="F8FAFC"/>
-            <w:tcMar>
-              <w:top w:w="50" w:type="dxa"/>
-              <w:bottom w:w="50" w:type="dxa"/>
-              <w:left w:w="60" w:type="dxa"/>
-              <w:right w:w="60" w:type="dxa"/>
-            </w:tcMar>
-          </w:tcPr>
-          <w:p>
-            <w:pPr>
-              <w:spacing w:before="0" w:after="0"/>
-            </w:pPr>
-            <w:r>
-              <w:rPr>
-                <w:b/>
-                <w:sz w:val="16"/>
-              </w:rPr>
-              <w:t>Extra Large (1280px)</w:t>
-            </w:r>
-          </w:p>
-        </w:tc>
-        <w:tc>
-          <w:tcPr>
-            <w:tcW w:type="dxa" w:w="2880"/>
-            <w:shd w:fill="F8FAFC"/>
-            <w:tcMar>
-              <w:top w:w="50" w:type="dxa"/>
-              <w:bottom w:w="50" w:type="dxa"/>
-              <w:left w:w="60" w:type="dxa"/>
-              <w:right w:w="60" w:type="dxa"/>
-            </w:tcMar>
-          </w:tcPr>
-          <w:p>
-            <w:pPr>
-              <w:spacing w:before="0" w:after="0"/>
-            </w:pPr>
-            <w:r>
-              <w:rPr>
-                <w:sz w:val="16"/>
-              </w:rPr>
-              <w:t>@media (min-width: 1280px)</w:t>
-            </w:r>
-          </w:p>
-        </w:tc>
-        <w:tc>
-          <w:tcPr>
-            <w:tcW w:type="dxa" w:w="1728"/>
-            <w:shd w:fill="F8FAFC"/>
-            <w:tcMar>
-              <w:top w:w="50" w:type="dxa"/>
-              <w:bottom w:w="50" w:type="dxa"/>
-              <w:left w:w="60" w:type="dxa"/>
-              <w:right w:w="60" w:type="dxa"/>
-            </w:tcMar>
-          </w:tcPr>
-          <w:p>
-            <w:pPr>
-              <w:spacing w:before="0" w:after="0"/>
-            </w:pPr>
-            <w:r>
-              <w:rPr>
-                <w:b/>
-                <w:sz w:val="16"/>
-              </w:rPr>
-              <w:t>4 cols + 1.5rem gap</w:t>
-            </w:r>
-          </w:p>
-        </w:tc>
-        <w:tc>
-          <w:tcPr>
-            <w:tcW w:type="dxa" w:w="2592"/>
-            <w:shd w:fill="F8FAFC"/>
-            <w:tcMar>
-              <w:top w:w="50" w:type="dxa"/>
-              <w:bottom w:w="50" w:type="dxa"/>
-              <w:left w:w="60" w:type="dxa"/>
-              <w:right w:w="60" w:type="dxa"/>
-            </w:tcMar>
-          </w:tcPr>
-          <w:p>
-            <w:pPr>
-              <w:spacing w:before="0" w:after="0"/>
-            </w:pPr>
-            <w:r>
-              <w:rPr>
-                <w:sz w:val="16"/>
-              </w:rPr>
-              <w:t>4 columns with expanded spacing on desktop</w:t>
-            </w:r>
-          </w:p>
-        </w:tc>
-      </w:tr>
-      <w:tr>
-        <w:tc>
-          <w:tcPr>
-            <w:tcW w:type="dxa" w:w="2700"/>
-          </w:tcPr>
-          <w:p/>
-        </w:tc>
-        <w:tc>
-          <w:tcPr>
-            <w:tcW w:type="dxa" w:w="2700"/>
-          </w:tcPr>
-          <w:p/>
-        </w:tc>
-        <w:tc>
-          <w:tcPr>
-            <w:tcW w:type="dxa" w:w="2700"/>
-          </w:tcPr>
-          <w:p/>
-        </w:tc>
-        <w:tc>
-          <w:tcPr>
-            <w:tcW w:type="dxa" w:w="2700"/>
-          </w:tcPr>
-          <w:p/>
-        </w:tc>
-      </w:tr>
-    </w:tbl>
-    <w:p>
-      <w:pPr>
-        <w:spacing w:after="80"/>
-      </w:pPr>
-    </w:p>
-    <w:p>
-      <w:pPr>
-        <w:keepNext/>
-        <w:spacing w:before="240" w:after="60"/>
-      </w:pPr>
-      <w:r>
-        <w:rPr>
-          <w:b/>
-          <w:color w:val="1A237E"/>
-          <w:sz w:val="23"/>
-        </w:rPr>
-        <w:t>6. Class Activity E: CSS Positioning (position.html)</w:t>
+        <w:t>grid-template-columns: 1fr; (1 column for phones)</w:t>
       </w:r>
     </w:p>
     <w:p>
@@ -1757,14 +920,13 @@
           <w:b/>
           <w:sz w:val="19"/>
         </w:rPr>
-        <w:t xml:space="preserve">Tested Scenarios: </w:t>
+        <w:t xml:space="preserve">• Small (@media (min-width: 640px)): </w:t>
       </w:r>
       <w:r>
         <w:rPr>
-          <w:color w:val="282828"/>
           <w:sz w:val="19"/>
         </w:rPr>
-        <w:t>Tested static, relative, absolute, fixed, and sticky positions:</w:t>
+        <w:t>grid-template-columns: repeat(2, 1fr); (2 columns)</w:t>
       </w:r>
     </w:p>
     <w:p>
@@ -1776,14 +938,13 @@
           <w:b/>
           <w:sz w:val="19"/>
         </w:rPr>
-        <w:t xml:space="preserve">• Static: </w:t>
+        <w:t xml:space="preserve">• Medium (@media (min-width: 768px)): </w:t>
       </w:r>
       <w:r>
         <w:rPr>
-          <w:color w:val="282828"/>
           <w:sz w:val="19"/>
         </w:rPr>
-        <w:t>Normal flow. All boxes render in HTML document order with normal gap spacing. No offsets apply.</w:t>
+        <w:t>grid-template-columns: repeat(3, 1fr); (3 columns)</w:t>
       </w:r>
     </w:p>
     <w:p>
@@ -1795,14 +956,13 @@
           <w:b/>
           <w:sz w:val="19"/>
         </w:rPr>
-        <w:t xml:space="preserve">• Relative: </w:t>
+        <w:t xml:space="preserve">• Large (@media (min-width: 1024px)): </w:t>
       </w:r>
       <w:r>
         <w:rPr>
-          <w:color w:val="282828"/>
           <w:sz w:val="19"/>
         </w:rPr>
-        <w:t>Middle navy box is nudged by top: 22px; left: 22px;. Its original space is reserved (dotted ghost), and neighbours stay put.</w:t>
+        <w:t>grid-template-columns: repeat(4, 1fr); (4 columns)</w:t>
       </w:r>
     </w:p>
     <w:p>
@@ -1814,14 +974,13 @@
           <w:b/>
           <w:sz w:val="19"/>
         </w:rPr>
-        <w:t xml:space="preserve">• Absolute: </w:t>
+        <w:t xml:space="preserve">• Extra large (@media (min-width: 1280px)): </w:t>
       </w:r>
       <w:r>
         <w:rPr>
-          <w:color w:val="282828"/>
           <w:sz w:val="19"/>
         </w:rPr>
-        <w:t>Mint box is completely removed from document flow. Neighbours slide together to close the gap. Box positions relative to origin red dot of .abs-frame (position: relative).</w:t>
+        <w:t>grid-template-columns: repeat(4, 1fr); gap: 1.5rem; (4 columns + wider gap)</w:t>
       </w:r>
     </w:p>
     <w:p>
@@ -1830,72 +989,9 @@
       </w:pPr>
       <w:r>
         <w:rPr>
-          <w:b/>
           <w:sz w:val="19"/>
         </w:rPr>
-        <w:t xml:space="preserve">• Fixed vs Sticky: </w:t>
-      </w:r>
-      <w:r>
-        <w:rPr>
-          <w:color w:val="282828"/>
-          <w:sz w:val="19"/>
-        </w:rPr>
-        <w:t>Fixed mint square stays anchored to bottom-right viewport during scroll. Sticky mint square sticks to top: 8px while inside pink parent, and leaves screen when parent exits view.</w:t>
-      </w:r>
-    </w:p>
-    <w:p>
-      <w:pPr>
-        <w:spacing w:before="0" w:after="80" w:line="276" w:lineRule="auto"/>
-      </w:pPr>
-      <w:r>
-        <w:rPr>
-          <w:b/>
-          <w:sz w:val="19"/>
-        </w:rPr>
-        <w:t xml:space="preserve">Required Lab Sentence Completions: </w:t>
-      </w:r>
-      <w:r>
-        <w:rPr>
-          <w:color w:val="282828"/>
-          <w:sz w:val="19"/>
-        </w:rPr>
-        <w:t>Sentence completions required by the lab:</w:t>
-      </w:r>
-    </w:p>
-    <w:p>
-      <w:pPr>
-        <w:spacing w:before="0" w:after="80" w:line="276" w:lineRule="auto"/>
-      </w:pPr>
-      <w:r>
-        <w:rPr>
-          <w:color w:val="282828"/>
-          <w:sz w:val="19"/>
-        </w:rPr>
-        <w:t>1. Static is the default document flow where elements are positioned in normal source order without offsets.</w:t>
-      </w:r>
-    </w:p>
-    <w:p>
-      <w:pPr>
-        <w:spacing w:before="0" w:after="80" w:line="276" w:lineRule="auto"/>
-      </w:pPr>
-      <w:r>
-        <w:rPr>
-          <w:color w:val="282828"/>
-          <w:sz w:val="19"/>
-        </w:rPr>
-        <w:t>2. Relative keeps a gap; absolute leaves normal flow and lets neighbours close the gap.</w:t>
-      </w:r>
-    </w:p>
-    <w:p>
-      <w:pPr>
-        <w:spacing w:before="0" w:after="80" w:line="276" w:lineRule="auto"/>
-      </w:pPr>
-      <w:r>
-        <w:rPr>
-          <w:color w:val="282828"/>
-          <w:sz w:val="19"/>
-        </w:rPr>
-        <w:t>3. Fixed follows the window; sticky follows its parent scrolling container.</w:t>
+        <w:t>Tested in Chrome DevTools device toolbar at 320px, 640px, 768px, 1024px, and 1280px. Every breakpoint changed the columns as expected.</w:t>
       </w:r>
     </w:p>
     <w:p>
@@ -1905,10 +1001,10 @@
       <w:r>
         <w:rPr>
           <w:b/>
-          <w:color w:val="646464"/>
+          <w:color w:val="505050"/>
           <w:sz w:val="16"/>
         </w:rPr>
-        <w:t>[Activity E: CSS Position Rules]</w:t>
+        <w:t>File: Week 04/breakpoints.html</w:t>
       </w:r>
     </w:p>
     <w:tbl>
@@ -1943,7 +1039,202 @@
                 <w:color w:val="141414"/>
                 <w:sz w:val="16"/>
               </w:rPr>
-              <w:t>/* position.html - CSS position rules */</w:t>
+              <w:t>/* breakpoints.html - Mobile-first media queries */</w:t>
+              <w:br/>
+              <w:t>.gallery { display: grid; grid-template-columns: 1fr; gap: 1rem; }</w:t>
+              <w:br/>
+              <w:t>@media (min-width: 640px)  { .gallery { grid-template-columns: repeat(2, 1fr); } }</w:t>
+              <w:br/>
+              <w:t>@media (min-width: 768px)  { .gallery { grid-template-columns: repeat(3, 1fr); } }</w:t>
+              <w:br/>
+              <w:t>@media (min-width: 1024px) { .gallery { grid-template-columns: repeat(4, 1fr); } }</w:t>
+              <w:br/>
+              <w:t>@media (min-width: 1280px) { .gallery { grid-template-columns: repeat(4, 1fr); gap: 1.5rem; } }</w:t>
+            </w:r>
+          </w:p>
+        </w:tc>
+      </w:tr>
+    </w:tbl>
+    <w:p>
+      <w:pPr>
+        <w:spacing w:after="80"/>
+      </w:pPr>
+    </w:p>
+    <w:p>
+      <w:pPr>
+        <w:keepNext/>
+        <w:spacing w:before="200" w:after="60"/>
+      </w:pPr>
+      <w:r>
+        <w:rPr>
+          <w:b/>
+          <w:sz w:val="22"/>
+        </w:rPr>
+        <w:t>6. Class Activity E: CSS Positioning (position.html)</w:t>
+      </w:r>
+    </w:p>
+    <w:p>
+      <w:pPr>
+        <w:spacing w:before="0" w:after="80" w:line="276" w:lineRule="auto"/>
+      </w:pPr>
+      <w:r>
+        <w:rPr>
+          <w:sz w:val="19"/>
+        </w:rPr>
+        <w:t>I tested all 5 CSS position values in position.html:</w:t>
+      </w:r>
+    </w:p>
+    <w:p>
+      <w:pPr>
+        <w:spacing w:before="0" w:after="80" w:line="276" w:lineRule="auto"/>
+      </w:pPr>
+      <w:r>
+        <w:rPr>
+          <w:b/>
+          <w:sz w:val="19"/>
+        </w:rPr>
+        <w:t xml:space="preserve">• Static: </w:t>
+      </w:r>
+      <w:r>
+        <w:rPr>
+          <w:sz w:val="19"/>
+        </w:rPr>
+        <w:t>Normal flow. Boxes sit in HTML order with regular gaps and no offset.</w:t>
+      </w:r>
+    </w:p>
+    <w:p>
+      <w:pPr>
+        <w:spacing w:before="0" w:after="80" w:line="276" w:lineRule="auto"/>
+      </w:pPr>
+      <w:r>
+        <w:rPr>
+          <w:b/>
+          <w:sz w:val="19"/>
+        </w:rPr>
+        <w:t xml:space="preserve">• Relative vs Absolute: </w:t>
+      </w:r>
+      <w:r>
+        <w:rPr>
+          <w:sz w:val="19"/>
+        </w:rPr>
+        <w:t>In relative, the middle box nudges by 22px but keeps its old seat (dotted ghost); other boxes do not move. In absolute, the mint box leaves the row completely and neighbours close the gap; it positions from the red dot (parent top-left with position: relative).</w:t>
+      </w:r>
+    </w:p>
+    <w:p>
+      <w:pPr>
+        <w:spacing w:before="0" w:after="80" w:line="276" w:lineRule="auto"/>
+      </w:pPr>
+      <w:r>
+        <w:rPr>
+          <w:b/>
+          <w:sz w:val="19"/>
+        </w:rPr>
+        <w:t xml:space="preserve">• Fixed vs Sticky: </w:t>
+      </w:r>
+      <w:r>
+        <w:rPr>
+          <w:sz w:val="19"/>
+        </w:rPr>
+        <w:t>The fixed mint square stays pinned at bottom-right of the window the whole time while scrolling. The sticky mint square stays stuck at top: 8px while inside the pink container, and disappears when the pink container scrolls off screen.</w:t>
+      </w:r>
+    </w:p>
+    <w:p>
+      <w:pPr>
+        <w:spacing w:before="0" w:after="80" w:line="276" w:lineRule="auto"/>
+      </w:pPr>
+      <w:r>
+        <w:rPr>
+          <w:b/>
+          <w:sz w:val="19"/>
+        </w:rPr>
+        <w:t xml:space="preserve">Lab Questions: </w:t>
+      </w:r>
+      <w:r>
+        <w:rPr>
+          <w:sz w:val="19"/>
+        </w:rPr>
+        <w:t>Lab Questions:</w:t>
+      </w:r>
+    </w:p>
+    <w:p>
+      <w:pPr>
+        <w:spacing w:before="0" w:after="80" w:line="276" w:lineRule="auto"/>
+      </w:pPr>
+      <w:r>
+        <w:rPr>
+          <w:sz w:val="19"/>
+        </w:rPr>
+        <w:t>1. Static is normal document flow in HTML order with no offset.</w:t>
+      </w:r>
+    </w:p>
+    <w:p>
+      <w:pPr>
+        <w:spacing w:before="0" w:after="80" w:line="276" w:lineRule="auto"/>
+      </w:pPr>
+      <w:r>
+        <w:rPr>
+          <w:sz w:val="19"/>
+        </w:rPr>
+        <w:t>2. Relative keeps a gap; absolute leaves normal flow and lets neighbours close the gap.</w:t>
+      </w:r>
+    </w:p>
+    <w:p>
+      <w:pPr>
+        <w:spacing w:before="0" w:after="80" w:line="276" w:lineRule="auto"/>
+      </w:pPr>
+      <w:r>
+        <w:rPr>
+          <w:sz w:val="19"/>
+        </w:rPr>
+        <w:t>3. Fixed follows the window; sticky follows its parent scrolling container.</w:t>
+      </w:r>
+    </w:p>
+    <w:p>
+      <w:pPr>
+        <w:spacing w:before="80" w:after="20"/>
+      </w:pPr>
+      <w:r>
+        <w:rPr>
+          <w:b/>
+          <w:color w:val="505050"/>
+          <w:sz w:val="16"/>
+        </w:rPr>
+        <w:t>File: Week 04/position.html</w:t>
+      </w:r>
+    </w:p>
+    <w:tbl>
+      <w:tblPr>
+        <w:tblW w:type="auto" w:w="0"/>
+        <w:jc w:val="center"/>
+        <w:tblLayout w:type="fixed"/>
+        <w:tblLook w:firstColumn="1" w:firstRow="1" w:lastColumn="0" w:lastRow="0" w:noHBand="0" w:noVBand="1" w:val="04A0"/>
+      </w:tblPr>
+      <w:tblGrid>
+        <w:gridCol w:w="10800"/>
+      </w:tblGrid>
+      <w:tr>
+        <w:tc>
+          <w:tcPr>
+            <w:tcW w:type="dxa" w:w="9360"/>
+            <w:shd w:fill="F5F5F5"/>
+            <w:tcMar>
+              <w:top w:w="80" w:type="dxa"/>
+              <w:bottom w:w="80" w:type="dxa"/>
+              <w:left w:w="120" w:type="dxa"/>
+              <w:right w:w="120" w:type="dxa"/>
+            </w:tcMar>
+          </w:tcPr>
+          <w:p>
+            <w:pPr>
+              <w:spacing w:before="0" w:after="0" w:line="252" w:lineRule="auto"/>
+            </w:pPr>
+            <w:r>
+              <w:rPr>
+                <w:rFonts w:ascii="Courier New" w:hAnsi="Courier New"/>
+                <w:color w:val="141414"/>
+                <w:sz w:val="16"/>
+              </w:rPr>
+              <w:t>/* position.html */</w:t>
               <w:br/>
               <w:t>.nudge { position: relative; top: 22px; left: 22px; }</w:t>
               <w:br/>
@@ -2009,7 +1300,7 @@
         <w:color w:val="646464"/>
         <w:sz w:val="16"/>
       </w:rPr>
-      <w:t>Web Engineering Lab Report - Muhammad Tayyab (023-24-0118)</w:t>
+      <w:t>Web Engineering Lab 04: Muhammad Tayyab (023-24-0118)</w:t>
     </w:r>
   </w:p>
 </w:hdr>

</xml_diff>